<commit_message>
Make deed properties editable, prioritize extraction
Allow users to edit deed property fields (address, city, state, county) directly in the workflow, and update the fallback logic to prefer extracted deed data over client contact information. Clarify the deed extraction prompt so that grantor is extracted as the current vested owner (grantee on the uploaded deed), not historical references, and recording references come from the uploaded deed itself. Fix useMemo dependency array and add label accessibility attributes.
</commit_message>
<xml_diff>
--- a/tools/aubreylaw-docgeneration/templates/deed.docx
+++ b/tools/aubreylaw-docgeneration/templates/deed.docx
@@ -186,7 +186,20 @@
           <w:sz w:val="24"/>
           <w:szCs w:val="24"/>
         </w:rPr>
-        <w:t xml:space="preserve">Prior deed recorded in Book {prior_deed_book}, Page {prior_deed_page}.</w:t>
+        <w:t xml:space="preserve">Prior deed recorded in Book {prior_deed_book}, Page {prior_deed_page}, dated {prior_deed_date}.</w:t>
+      </w:r>
+    </w:p>
+    <w:p>
+      <w:pPr>
+        <w:spacing w:after="120"/>
+      </w:pPr>
+      <w:r>
+        <w:rPr>
+          <w:rFonts w:ascii="Times New Roman" w:cs="Times New Roman" w:eastAsia="Times New Roman" w:hAnsi="Times New Roman"/>
+          <w:sz w:val="24"/>
+          <w:szCs w:val="24"/>
+        </w:rPr>
+        <w:t xml:space="preserve">Certificate number: {certificate_number}</w:t>
       </w:r>
     </w:p>
     <w:p>

</xml_diff>